<commit_message>
Update Lab-2 documentation with live Jira issue keys (PHR-1 to PHR-9), sprint metrics & direct links
</commit_message>
<xml_diff>
--- a/LAB2/Deliverables/Agile_Backlog_and_Sprint_Simulation.docx
+++ b/LAB2/Deliverables/Agile_Backlog_and_Sprint_Simulation.docx
@@ -20,7 +20,7 @@
         </w:rPr>
         <w:t>Lab 2: Agile Backlog Creation &amp; Sprint Simulation in Jira</w:t>
         <w:br/>
-        <w:t>PES University — Department of CSE | Problem Statement #13</w:t>
+        <w:t>PES University — Department of CSE | Problem Statement #13 | Project Key: PHR</w:t>
       </w:r>
     </w:p>
     <w:p>
@@ -28,12 +28,12 @@
         <w:pStyle w:val="Heading1"/>
       </w:pPr>
       <w:r>
-        <w:t>1. Executive Summary &amp; Problem Context</w:t>
+        <w:t>1. Executive Summary &amp; Jira Cloud Setup</w:t>
       </w:r>
     </w:p>
     <w:p>
       <w:r>
-        <w:t>Following the requirements engineered in Lab 1 for Problem Statement #13 (Patient Health Record Consent Management System), this laboratory exercises Agile Project Management utilizing Atlassian Jira Cloud. Functional Requirements (FR-001 through FR-005) and Non-Functional Requirements (NFR-001, NFR-002) are decomposed into Epics and User Stories, estimated using Planning Poker with the Fibonacci sequence (1, 2, 3, 5, 8), organized into a Product Backlog, and simulated across a 1-week time-boxed sprint (Sprint 1) with burndown chart evaluation.</w:t>
+        <w:t>Following the requirements engineered in Lab 1 for Problem Statement #13 (Patient Health Record Consent Management System), this laboratory exercises Agile Project Management utilizing Atlassian Jira Cloud (https://abhays11.atlassian.net). Functional Requirements (FR-001 through FR-005) and Non-Functional Requirements (NFR-001, NFR-002) were converted into Epics (PHR-1 to PHR-3) and User Stories (PHR-4 to PHR-9), estimated using Planning Poker with the Fibonacci sequence (1, 2, 3, 5, 8), and simulated across a 1-week time-boxed sprint (Sprint 1, ID: 36) with burndown chart evaluation.</w:t>
       </w:r>
     </w:p>
     <w:p>
@@ -51,14 +51,28 @@
         <w:tblLook w:firstColumn="1" w:firstRow="1" w:lastColumn="0" w:lastRow="0" w:noHBand="0" w:noVBand="1" w:val="04A0"/>
       </w:tblPr>
       <w:tblGrid>
-        <w:gridCol w:w="3360"/>
-        <w:gridCol w:w="3360"/>
-        <w:gridCol w:w="3360"/>
+        <w:gridCol w:w="2520"/>
+        <w:gridCol w:w="2520"/>
+        <w:gridCol w:w="2520"/>
+        <w:gridCol w:w="2520"/>
       </w:tblGrid>
       <w:tr>
         <w:tc>
           <w:tcPr>
-            <w:tcW w:type="dxa" w:w="3360"/>
+            <w:tcW w:type="dxa" w:w="2520"/>
+          </w:tcPr>
+          <w:p>
+            <w:r>
+              <w:rPr>
+                <w:b/>
+              </w:rPr>
+              <w:t>Key</w:t>
+            </w:r>
+          </w:p>
+        </w:tc>
+        <w:tc>
+          <w:tcPr>
+            <w:tcW w:type="dxa" w:w="2520"/>
           </w:tcPr>
           <w:p>
             <w:r>
@@ -71,20 +85,20 @@
         </w:tc>
         <w:tc>
           <w:tcPr>
-            <w:tcW w:type="dxa" w:w="3360"/>
+            <w:tcW w:type="dxa" w:w="2520"/>
           </w:tcPr>
           <w:p>
             <w:r>
               <w:rPr>
                 <w:b/>
               </w:rPr>
-              <w:t>Associated Requirements</w:t>
+              <w:t>Requirements</w:t>
             </w:r>
           </w:p>
         </w:tc>
         <w:tc>
           <w:tcPr>
-            <w:tcW w:type="dxa" w:w="3360"/>
+            <w:tcW w:type="dxa" w:w="2520"/>
           </w:tcPr>
           <w:p>
             <w:r>
@@ -99,7 +113,17 @@
       <w:tr>
         <w:tc>
           <w:tcPr>
-            <w:tcW w:type="dxa" w:w="3360"/>
+            <w:tcW w:type="dxa" w:w="2520"/>
+          </w:tcPr>
+          <w:p>
+            <w:r>
+              <w:t>PHR-1</w:t>
+            </w:r>
+          </w:p>
+        </w:tc>
+        <w:tc>
+          <w:tcPr>
+            <w:tcW w:type="dxa" w:w="2520"/>
           </w:tcPr>
           <w:p>
             <w:r>
@@ -109,7 +133,7 @@
         </w:tc>
         <w:tc>
           <w:tcPr>
-            <w:tcW w:type="dxa" w:w="3360"/>
+            <w:tcW w:type="dxa" w:w="2520"/>
           </w:tcPr>
           <w:p>
             <w:r>
@@ -119,7 +143,7 @@
         </w:tc>
         <w:tc>
           <w:tcPr>
-            <w:tcW w:type="dxa" w:w="3360"/>
+            <w:tcW w:type="dxa" w:w="2520"/>
           </w:tcPr>
           <w:p>
             <w:r>
@@ -131,7 +155,17 @@
       <w:tr>
         <w:tc>
           <w:tcPr>
-            <w:tcW w:type="dxa" w:w="3360"/>
+            <w:tcW w:type="dxa" w:w="2520"/>
+          </w:tcPr>
+          <w:p>
+            <w:r>
+              <w:t>PHR-2</w:t>
+            </w:r>
+          </w:p>
+        </w:tc>
+        <w:tc>
+          <w:tcPr>
+            <w:tcW w:type="dxa" w:w="2520"/>
           </w:tcPr>
           <w:p>
             <w:r>
@@ -141,7 +175,7 @@
         </w:tc>
         <w:tc>
           <w:tcPr>
-            <w:tcW w:type="dxa" w:w="3360"/>
+            <w:tcW w:type="dxa" w:w="2520"/>
           </w:tcPr>
           <w:p>
             <w:r>
@@ -151,7 +185,7 @@
         </w:tc>
         <w:tc>
           <w:tcPr>
-            <w:tcW w:type="dxa" w:w="3360"/>
+            <w:tcW w:type="dxa" w:w="2520"/>
           </w:tcPr>
           <w:p>
             <w:r>
@@ -163,7 +197,17 @@
       <w:tr>
         <w:tc>
           <w:tcPr>
-            <w:tcW w:type="dxa" w:w="3360"/>
+            <w:tcW w:type="dxa" w:w="2520"/>
+          </w:tcPr>
+          <w:p>
+            <w:r>
+              <w:t>PHR-3</w:t>
+            </w:r>
+          </w:p>
+        </w:tc>
+        <w:tc>
+          <w:tcPr>
+            <w:tcW w:type="dxa" w:w="2520"/>
           </w:tcPr>
           <w:p>
             <w:r>
@@ -173,7 +217,7 @@
         </w:tc>
         <w:tc>
           <w:tcPr>
-            <w:tcW w:type="dxa" w:w="3360"/>
+            <w:tcW w:type="dxa" w:w="2520"/>
           </w:tcPr>
           <w:p>
             <w:r>
@@ -183,7 +227,7 @@
         </w:tc>
         <w:tc>
           <w:tcPr>
-            <w:tcW w:type="dxa" w:w="3360"/>
+            <w:tcW w:type="dxa" w:w="2520"/>
           </w:tcPr>
           <w:p>
             <w:r>
@@ -208,17 +252,18 @@
         <w:tblLook w:firstColumn="1" w:firstRow="1" w:lastColumn="0" w:lastRow="0" w:noHBand="0" w:noVBand="1" w:val="04A0"/>
       </w:tblPr>
       <w:tblGrid>
-        <w:gridCol w:w="1680"/>
-        <w:gridCol w:w="1680"/>
-        <w:gridCol w:w="1680"/>
-        <w:gridCol w:w="1680"/>
-        <w:gridCol w:w="1680"/>
-        <w:gridCol w:w="1680"/>
+        <w:gridCol w:w="1440"/>
+        <w:gridCol w:w="1440"/>
+        <w:gridCol w:w="1440"/>
+        <w:gridCol w:w="1440"/>
+        <w:gridCol w:w="1440"/>
+        <w:gridCol w:w="1440"/>
+        <w:gridCol w:w="1440"/>
       </w:tblGrid>
       <w:tr>
         <w:tc>
           <w:tcPr>
-            <w:tcW w:type="dxa" w:w="1680"/>
+            <w:tcW w:type="dxa" w:w="1440"/>
           </w:tcPr>
           <w:p>
             <w:r>
@@ -231,20 +276,33 @@
         </w:tc>
         <w:tc>
           <w:tcPr>
-            <w:tcW w:type="dxa" w:w="1680"/>
+            <w:tcW w:type="dxa" w:w="1440"/>
           </w:tcPr>
           <w:p>
             <w:r>
               <w:rPr>
                 <w:b/>
               </w:rPr>
-              <w:t>Epic</w:t>
+              <w:t>Jira Key</w:t>
             </w:r>
           </w:p>
         </w:tc>
         <w:tc>
           <w:tcPr>
-            <w:tcW w:type="dxa" w:w="1680"/>
+            <w:tcW w:type="dxa" w:w="1440"/>
+          </w:tcPr>
+          <w:p>
+            <w:r>
+              <w:rPr>
+                <w:b/>
+              </w:rPr>
+              <w:t>Parent Epic</w:t>
+            </w:r>
+          </w:p>
+        </w:tc>
+        <w:tc>
+          <w:tcPr>
+            <w:tcW w:type="dxa" w:w="1440"/>
           </w:tcPr>
           <w:p>
             <w:r>
@@ -257,7 +315,7 @@
         </w:tc>
         <w:tc>
           <w:tcPr>
-            <w:tcW w:type="dxa" w:w="1680"/>
+            <w:tcW w:type="dxa" w:w="1440"/>
           </w:tcPr>
           <w:p>
             <w:r>
@@ -270,7 +328,7 @@
         </w:tc>
         <w:tc>
           <w:tcPr>
-            <w:tcW w:type="dxa" w:w="1680"/>
+            <w:tcW w:type="dxa" w:w="1440"/>
           </w:tcPr>
           <w:p>
             <w:r>
@@ -283,14 +341,14 @@
         </w:tc>
         <w:tc>
           <w:tcPr>
-            <w:tcW w:type="dxa" w:w="1680"/>
+            <w:tcW w:type="dxa" w:w="1440"/>
           </w:tcPr>
           <w:p>
             <w:r>
               <w:rPr>
                 <w:b/>
               </w:rPr>
-              <w:t>Acceptance Criteria &amp; Rationale</w:t>
+              <w:t>Acceptance Criteria &amp; Status</w:t>
             </w:r>
           </w:p>
         </w:tc>
@@ -298,7 +356,7 @@
       <w:tr>
         <w:tc>
           <w:tcPr>
-            <w:tcW w:type="dxa" w:w="1680"/>
+            <w:tcW w:type="dxa" w:w="1440"/>
           </w:tcPr>
           <w:p>
             <w:r>
@@ -308,17 +366,27 @@
         </w:tc>
         <w:tc>
           <w:tcPr>
-            <w:tcW w:type="dxa" w:w="1680"/>
+            <w:tcW w:type="dxa" w:w="1440"/>
           </w:tcPr>
           <w:p>
             <w:r>
-              <w:t>Epic 1</w:t>
+              <w:t>PHR-4</w:t>
             </w:r>
           </w:p>
         </w:tc>
         <w:tc>
           <w:tcPr>
-            <w:tcW w:type="dxa" w:w="1680"/>
+            <w:tcW w:type="dxa" w:w="1440"/>
+          </w:tcPr>
+          <w:p>
+            <w:r>
+              <w:t>Epic 1 (PHR-1)</w:t>
+            </w:r>
+          </w:p>
+        </w:tc>
+        <w:tc>
+          <w:tcPr>
+            <w:tcW w:type="dxa" w:w="1440"/>
           </w:tcPr>
           <w:p>
             <w:r>
@@ -328,7 +396,7 @@
         </w:tc>
         <w:tc>
           <w:tcPr>
-            <w:tcW w:type="dxa" w:w="1680"/>
+            <w:tcW w:type="dxa" w:w="1440"/>
           </w:tcPr>
           <w:p>
             <w:r>
@@ -338,7 +406,7 @@
         </w:tc>
         <w:tc>
           <w:tcPr>
-            <w:tcW w:type="dxa" w:w="1680"/>
+            <w:tcW w:type="dxa" w:w="1440"/>
           </w:tcPr>
           <w:p>
             <w:r>
@@ -348,20 +416,18 @@
         </w:tc>
         <w:tc>
           <w:tcPr>
-            <w:tcW w:type="dxa" w:w="1680"/>
+            <w:tcW w:type="dxa" w:w="1440"/>
           </w:tcPr>
           <w:p>
             <w:r>
+              <w:t>Status: Done (Sprint 1)</w:t>
+              <w:br/>
+              <w:br/>
               <w:t>AC:</w:t>
               <w:br/>
               <w:t>Pass: Auto-revokes on expiry timestamp.</w:t>
               <w:br/>
               <w:t>Fail: Clinic accesses records post-expiry.</w:t>
-              <w:br/>
-              <w:br/>
-              <w:t>Rationale:</w:t>
-              <w:br/>
-              <w:t>Complex timer scheduler and granular permission matrix.</w:t>
             </w:r>
           </w:p>
         </w:tc>
@@ -369,7 +435,7 @@
       <w:tr>
         <w:tc>
           <w:tcPr>
-            <w:tcW w:type="dxa" w:w="1680"/>
+            <w:tcW w:type="dxa" w:w="1440"/>
           </w:tcPr>
           <w:p>
             <w:r>
@@ -379,17 +445,27 @@
         </w:tc>
         <w:tc>
           <w:tcPr>
-            <w:tcW w:type="dxa" w:w="1680"/>
+            <w:tcW w:type="dxa" w:w="1440"/>
           </w:tcPr>
           <w:p>
             <w:r>
-              <w:t>Epic 1</w:t>
+              <w:t>PHR-5</w:t>
             </w:r>
           </w:p>
         </w:tc>
         <w:tc>
           <w:tcPr>
-            <w:tcW w:type="dxa" w:w="1680"/>
+            <w:tcW w:type="dxa" w:w="1440"/>
+          </w:tcPr>
+          <w:p>
+            <w:r>
+              <w:t>Epic 1 (PHR-1)</w:t>
+            </w:r>
+          </w:p>
+        </w:tc>
+        <w:tc>
+          <w:tcPr>
+            <w:tcW w:type="dxa" w:w="1440"/>
           </w:tcPr>
           <w:p>
             <w:r>
@@ -399,7 +475,7 @@
         </w:tc>
         <w:tc>
           <w:tcPr>
-            <w:tcW w:type="dxa" w:w="1680"/>
+            <w:tcW w:type="dxa" w:w="1440"/>
           </w:tcPr>
           <w:p>
             <w:r>
@@ -409,7 +485,7 @@
         </w:tc>
         <w:tc>
           <w:tcPr>
-            <w:tcW w:type="dxa" w:w="1680"/>
+            <w:tcW w:type="dxa" w:w="1440"/>
           </w:tcPr>
           <w:p>
             <w:r>
@@ -419,20 +495,18 @@
         </w:tc>
         <w:tc>
           <w:tcPr>
-            <w:tcW w:type="dxa" w:w="1680"/>
+            <w:tcW w:type="dxa" w:w="1440"/>
           </w:tcPr>
           <w:p>
             <w:r>
+              <w:t>Status: Done (Sprint 1)</w:t>
+              <w:br/>
+              <w:br/>
               <w:t>AC:</w:t>
               <w:br/>
               <w:t>Pass: Access 1s after revocation is denied.</w:t>
               <w:br/>
               <w:t>Fail: Token retains access post-revocation.</w:t>
-              <w:br/>
-              <w:br/>
-              <w:t>Rationale:</w:t>
-              <w:br/>
-              <w:t>Atomic state mutation and token revocation check.</w:t>
             </w:r>
           </w:p>
         </w:tc>
@@ -440,7 +514,7 @@
       <w:tr>
         <w:tc>
           <w:tcPr>
-            <w:tcW w:type="dxa" w:w="1680"/>
+            <w:tcW w:type="dxa" w:w="1440"/>
           </w:tcPr>
           <w:p>
             <w:r>
@@ -450,17 +524,27 @@
         </w:tc>
         <w:tc>
           <w:tcPr>
-            <w:tcW w:type="dxa" w:w="1680"/>
+            <w:tcW w:type="dxa" w:w="1440"/>
           </w:tcPr>
           <w:p>
             <w:r>
-              <w:t>Epic 2</w:t>
+              <w:t>PHR-6</w:t>
             </w:r>
           </w:p>
         </w:tc>
         <w:tc>
           <w:tcPr>
-            <w:tcW w:type="dxa" w:w="1680"/>
+            <w:tcW w:type="dxa" w:w="1440"/>
+          </w:tcPr>
+          <w:p>
+            <w:r>
+              <w:t>Epic 2 (PHR-2)</w:t>
+            </w:r>
+          </w:p>
+        </w:tc>
+        <w:tc>
+          <w:tcPr>
+            <w:tcW w:type="dxa" w:w="1440"/>
           </w:tcPr>
           <w:p>
             <w:r>
@@ -470,7 +554,7 @@
         </w:tc>
         <w:tc>
           <w:tcPr>
-            <w:tcW w:type="dxa" w:w="1680"/>
+            <w:tcW w:type="dxa" w:w="1440"/>
           </w:tcPr>
           <w:p>
             <w:r>
@@ -480,7 +564,7 @@
         </w:tc>
         <w:tc>
           <w:tcPr>
-            <w:tcW w:type="dxa" w:w="1680"/>
+            <w:tcW w:type="dxa" w:w="1440"/>
           </w:tcPr>
           <w:p>
             <w:r>
@@ -490,20 +574,18 @@
         </w:tc>
         <w:tc>
           <w:tcPr>
-            <w:tcW w:type="dxa" w:w="1680"/>
+            <w:tcW w:type="dxa" w:w="1440"/>
           </w:tcPr>
           <w:p>
             <w:r>
+              <w:t>Status: Done (Sprint 1)</w:t>
+              <w:br/>
+              <w:br/>
               <w:t>AC:</w:t>
               <w:br/>
               <w:t>Pass: Valid scope and duration delivered to patient.</w:t>
               <w:br/>
               <w:t>Fail: Missing mandatory metadata accepted.</w:t>
-              <w:br/>
-              <w:br/>
-              <w:t>Rationale:</w:t>
-              <w:br/>
-              <w:t>Clinical taxonomy scoping, input validation, request queuing.</w:t>
             </w:r>
           </w:p>
         </w:tc>
@@ -511,7 +593,7 @@
       <w:tr>
         <w:tc>
           <w:tcPr>
-            <w:tcW w:type="dxa" w:w="1680"/>
+            <w:tcW w:type="dxa" w:w="1440"/>
           </w:tcPr>
           <w:p>
             <w:r>
@@ -521,17 +603,27 @@
         </w:tc>
         <w:tc>
           <w:tcPr>
-            <w:tcW w:type="dxa" w:w="1680"/>
+            <w:tcW w:type="dxa" w:w="1440"/>
           </w:tcPr>
           <w:p>
             <w:r>
-              <w:t>Epic 2</w:t>
+              <w:t>PHR-7</w:t>
             </w:r>
           </w:p>
         </w:tc>
         <w:tc>
           <w:tcPr>
-            <w:tcW w:type="dxa" w:w="1680"/>
+            <w:tcW w:type="dxa" w:w="1440"/>
+          </w:tcPr>
+          <w:p>
+            <w:r>
+              <w:t>Epic 2 (PHR-2)</w:t>
+            </w:r>
+          </w:p>
+        </w:tc>
+        <w:tc>
+          <w:tcPr>
+            <w:tcW w:type="dxa" w:w="1440"/>
           </w:tcPr>
           <w:p>
             <w:r>
@@ -541,7 +633,7 @@
         </w:tc>
         <w:tc>
           <w:tcPr>
-            <w:tcW w:type="dxa" w:w="1680"/>
+            <w:tcW w:type="dxa" w:w="1440"/>
           </w:tcPr>
           <w:p>
             <w:r>
@@ -551,7 +643,7 @@
         </w:tc>
         <w:tc>
           <w:tcPr>
-            <w:tcW w:type="dxa" w:w="1680"/>
+            <w:tcW w:type="dxa" w:w="1440"/>
           </w:tcPr>
           <w:p>
             <w:r>
@@ -561,20 +653,18 @@
         </w:tc>
         <w:tc>
           <w:tcPr>
-            <w:tcW w:type="dxa" w:w="1680"/>
+            <w:tcW w:type="dxa" w:w="1440"/>
           </w:tcPr>
           <w:p>
             <w:r>
+              <w:t>Status: Done (Sprint 1)</w:t>
+              <w:br/>
+              <w:br/>
               <w:t>AC:</w:t>
               <w:br/>
               <w:t>Pass: Valid registry status allows forwarding.</w:t>
               <w:br/>
               <w:t>Fail: Unverified credentials allow delivery.</w:t>
-              <w:br/>
-              <w:br/>
-              <w:t>Rationale:</w:t>
-              <w:br/>
-              <w:t>External registry API, mTLS handshake, fallback caching, high uncertainty.</w:t>
             </w:r>
           </w:p>
         </w:tc>
@@ -582,7 +672,7 @@
       <w:tr>
         <w:tc>
           <w:tcPr>
-            <w:tcW w:type="dxa" w:w="1680"/>
+            <w:tcW w:type="dxa" w:w="1440"/>
           </w:tcPr>
           <w:p>
             <w:r>
@@ -592,17 +682,27 @@
         </w:tc>
         <w:tc>
           <w:tcPr>
-            <w:tcW w:type="dxa" w:w="1680"/>
+            <w:tcW w:type="dxa" w:w="1440"/>
           </w:tcPr>
           <w:p>
             <w:r>
-              <w:t>Epic 3</w:t>
+              <w:t>PHR-8</w:t>
             </w:r>
           </w:p>
         </w:tc>
         <w:tc>
           <w:tcPr>
-            <w:tcW w:type="dxa" w:w="1680"/>
+            <w:tcW w:type="dxa" w:w="1440"/>
+          </w:tcPr>
+          <w:p>
+            <w:r>
+              <w:t>Epic 3 (PHR-3)</w:t>
+            </w:r>
+          </w:p>
+        </w:tc>
+        <w:tc>
+          <w:tcPr>
+            <w:tcW w:type="dxa" w:w="1440"/>
           </w:tcPr>
           <w:p>
             <w:r>
@@ -612,7 +712,7 @@
         </w:tc>
         <w:tc>
           <w:tcPr>
-            <w:tcW w:type="dxa" w:w="1680"/>
+            <w:tcW w:type="dxa" w:w="1440"/>
           </w:tcPr>
           <w:p>
             <w:r>
@@ -622,7 +722,7 @@
         </w:tc>
         <w:tc>
           <w:tcPr>
-            <w:tcW w:type="dxa" w:w="1680"/>
+            <w:tcW w:type="dxa" w:w="1440"/>
           </w:tcPr>
           <w:p>
             <w:r>
@@ -632,20 +732,18 @@
         </w:tc>
         <w:tc>
           <w:tcPr>
-            <w:tcW w:type="dxa" w:w="1680"/>
+            <w:tcW w:type="dxa" w:w="1440"/>
           </w:tcPr>
           <w:p>
             <w:r>
+              <w:t>Status: Staged (Sprint 2)</w:t>
+              <w:br/>
+              <w:br/>
               <w:t>AC:</w:t>
               <w:br/>
               <w:t>Pass: Push alert arrives within 2s and 1h prior.</w:t>
               <w:br/>
               <w:t>Fail: Alerts dropped or delayed.</w:t>
-              <w:br/>
-              <w:br/>
-              <w:t>Rationale:</w:t>
-              <w:br/>
-              <w:t>Standard push/webhook notification service.</w:t>
             </w:r>
           </w:p>
         </w:tc>
@@ -653,7 +751,7 @@
       <w:tr>
         <w:tc>
           <w:tcPr>
-            <w:tcW w:type="dxa" w:w="1680"/>
+            <w:tcW w:type="dxa" w:w="1440"/>
           </w:tcPr>
           <w:p>
             <w:r>
@@ -663,17 +761,27 @@
         </w:tc>
         <w:tc>
           <w:tcPr>
-            <w:tcW w:type="dxa" w:w="1680"/>
+            <w:tcW w:type="dxa" w:w="1440"/>
           </w:tcPr>
           <w:p>
             <w:r>
-              <w:t>Epic 3</w:t>
+              <w:t>PHR-9</w:t>
             </w:r>
           </w:p>
         </w:tc>
         <w:tc>
           <w:tcPr>
-            <w:tcW w:type="dxa" w:w="1680"/>
+            <w:tcW w:type="dxa" w:w="1440"/>
+          </w:tcPr>
+          <w:p>
+            <w:r>
+              <w:t>Epic 3 (PHR-3)</w:t>
+            </w:r>
+          </w:p>
+        </w:tc>
+        <w:tc>
+          <w:tcPr>
+            <w:tcW w:type="dxa" w:w="1440"/>
           </w:tcPr>
           <w:p>
             <w:r>
@@ -683,7 +791,7 @@
         </w:tc>
         <w:tc>
           <w:tcPr>
-            <w:tcW w:type="dxa" w:w="1680"/>
+            <w:tcW w:type="dxa" w:w="1440"/>
           </w:tcPr>
           <w:p>
             <w:r>
@@ -693,7 +801,7 @@
         </w:tc>
         <w:tc>
           <w:tcPr>
-            <w:tcW w:type="dxa" w:w="1680"/>
+            <w:tcW w:type="dxa" w:w="1440"/>
           </w:tcPr>
           <w:p>
             <w:r>
@@ -703,20 +811,18 @@
         </w:tc>
         <w:tc>
           <w:tcPr>
-            <w:tcW w:type="dxa" w:w="1680"/>
+            <w:tcW w:type="dxa" w:w="1440"/>
           </w:tcPr>
           <w:p>
             <w:r>
+              <w:t>Status: Staged (Sprint 2)</w:t>
+              <w:br/>
+              <w:br/>
               <w:t>AC:</w:t>
               <w:br/>
               <w:t>Pass: Tamper-evident digest logged under 300ms.</w:t>
               <w:br/>
               <w:t>Fail: Audit records can be edited or deleted.</w:t>
-              <w:br/>
-              <w:br/>
-              <w:t>Rationale:</w:t>
-              <w:br/>
-              <w:t>Append-only data pipeline, cryptographic hashing, latency constraints.</w:t>
             </w:r>
           </w:p>
         </w:tc>
@@ -732,16 +838,16 @@
     </w:p>
     <w:p>
       <w:r>
-        <w:t>Sprint Name: PHR Sprint 1 — Core Consent &amp; Provider Gateway</w:t>
+        <w:t>• Sprint Name: PHR Sprint 1 (Sprint ID: 36)</w:t>
         <w:br/>
-        <w:t>Duration: 1 Week (Simulated)</w:t>
+        <w:t>• Duration: 1 Week (Simulated)</w:t>
         <w:br/>
-        <w:t>Sprint Goal: Implement and verify core patient consent granting, instant revocation, and provider identity validation.</w:t>
+        <w:t>• Sprint Goal: Implement and verify core patient consent granting, instant revocation, and provider identity validation.</w:t>
         <w:br/>
-        <w:t>Committed Scope: US-01 (5 SP), US-02 (3 SP), US-03 (5 SP), US-04 (8 SP) = Total 21 Story Points.</w:t>
+        <w:t>• Committed Scope: PHR-4 (5 SP), PHR-5 (3 SP), PHR-6 (5 SP), PHR-7 (8 SP) = Total 21 Story Points.</w:t>
         <w:br/>
         <w:br/>
-        <w:t>Workflow: Issues progressed from To Do -&gt; In Progress -&gt; Done following peer review, acceptance verification, and audit conformance. All 21 story points were completed within the timebox. Remaining items (US-05, US-06) were rolled over to Sprint 2 (PHR Sprint 2 — Alerts &amp; Immutable Auditing).</w:t>
+        <w:t>• Workflow &amp; Completion: Issues progressed from To Do -&gt; In Progress -&gt; Done following acceptance criteria verification. All 21 story points were completed (100% completion rate). Remaining items (PHR-8, PHR-9) were rolled over to Sprint 2 (PHR Sprint 2, Sprint ID: 37).</w:t>
       </w:r>
     </w:p>
     <w:p>
@@ -758,7 +864,7 @@
         <w:br/>
         <w:t>• Ideal Guideline: Linear reduction from 21 points on Day 1 to 0 points on Day 7 (-3.0 points/day).</w:t>
         <w:br/>
-        <w:t>• Actual Burndown: Stories were burned down in increments: Day 3 (-3 SP for US-02), Day 4 (-5 SP for US-01), Day 5 (-5 SP for US-03), and Day 7 (-8 SP for US-04 after integration validation).</w:t>
+        <w:t>• Actual Burndown: Stories burned down in increments: Day 3 (-3 SP for PHR-5), Day 4 (-5 SP for PHR-4), Day 5 (-5 SP for PHR-6), and Day 7 (-8 SP for PHR-7 after end-to-end registry validation).</w:t>
         <w:br/>
         <w:t>• Conclusion: Stable team velocity of 21 points per iteration achieved without scope creep.</w:t>
       </w:r>
@@ -781,7 +887,7 @@
     </w:p>
     <w:p>
       <w:r>
-        <w:t>Yes. Using Planning Poker and the Fibonacci sequence (1, 2, 3, 5, 8) accurately captured relative effort and uncertainty. Well-understood internal features like US-02 (immediate revocation, 3 SP) took significantly less time than US-04 (8 SP), which required interfacing with an external registry API, security handshakes, and failure handling.</w:t>
+        <w:t>Yes. Using Planning Poker and the Fibonacci sequence (1, 2, 3, 5, 8) accurately captured relative effort and uncertainty. Well-understood internal features like PHR-5 (immediate revocation, 3 SP) took significantly less time than PHR-7 (8 SP), which required interfacing with an external registry API, security handshakes, and failure handling.</w:t>
       </w:r>
     </w:p>
     <w:p>
@@ -794,7 +900,7 @@
     </w:p>
     <w:p>
       <w:r>
-        <w:t>Yes. Backlog items were prioritized using MoSCoW analysis and architectural risk. Foundational authorization and security features (US-01 through US-04) were marked High Priority and completed in Sprint 1. Convenience features like real-time notifications (US-05) were prioritized for Sprint 2 to build on top of a stable core consent engine.</w:t>
+        <w:t>Yes. Backlog items were prioritized using MoSCoW analysis and architectural risk. Foundational authorization and security features (PHR-4 through PHR-7) were marked High Priority and completed in Sprint 1. Convenience features like real-time notifications (PHR-8) were prioritized for Sprint 2 to build on top of a stable core consent engine.</w:t>
       </w:r>
     </w:p>
     <w:p>

</xml_diff>